<commit_message>
Technical courseware: facet-preview reading guide + retire rules
- Tags & the Domain Pack companion gains "Reading the Search facet
  preview (and when to retire a tag)": counts = app-reviewed usage not
  live PDC; all-empty = freshly reseeded; retire only after a full scan
  of every source (Retire empty company tags button, generic baseline
  protected); policies fill PDC's real facet, and the Policy
  Generator's drift-check is the authoritative dead-tag signal.
- TT Module 03 lab intro gains a "Tags stay governed" note bridging
  the lab's applyTags to the facet preview and the retire rules;
  docx rebuilt and Word-COM verified.

Co-Authored-By: Claude Fable 5 <noreply@anthropic.com>
</commit_message>
<xml_diff>
--- a/courseware/CSCU/Technical-Track/03-Build-Your-Own-Dictionary-and-Pattern/Lab-Build-Your-Own-CSCU-Dictionary-and-Pattern.docx
+++ b/courseware/CSCU/Technical-Track/03-Build-Your-Own-Dictionary-and-Pattern/Lab-Build-Your-Own-CSCU-Dictionary-and-Pattern.docx
@@ -150,6 +150,58 @@
           <w:szCs w:val="24"/>
         </w:rPr>
         <w:t xml:space="preserve">Copper State Credit Union (cscu_core + cscu-documents)</w:t>
+      </w:r>
+    </w:p>
+    <w:p>
+      <w:pPr>
+        <w:pBdr>
+          <w:left w:val="single" w:sz="12" w:space="8" w:color="065A82"/>
+        </w:pBdr>
+        <w:shd w:val="clear" w:color="auto" w:fill="EEF6FA"/>
+        <w:ind w:left="240" w:right="240"/>
+        <w:spacing w:before="120" w:after="160"/>
+      </w:pPr>
+      <w:r>
+        <w:rPr>
+          <w:b/>
+          <w:bCs/>
+        </w:rPr>
+        <w:t xml:space="preserve">Tags stay governed.</w:t>
+      </w:r>
+      <w:r>
+        <w:t xml:space="preserve"> Every </w:t>
+      </w:r>
+      <w:r>
+        <w:rPr>
+          <w:rFonts w:ascii="Consolas" w:hAnsi="Consolas"/>
+          <w:color w:val="0A5560"/>
+          <w:sz w:val="20"/>
+          <w:szCs w:val="20"/>
+        </w:rPr>
+        <w:t xml:space="preserve">applyTags</w:t>
+      </w:r>
+      <w:r>
+        <w:t xml:space="preserve"> value in this lab comes from the app's governed vocabulary, and the app's Dictionary page previews how those tags will look as search facets — including which buckets are still empty. Empty there means </w:t>
+      </w:r>
+      <w:r>
+        <w:rPr>
+          <w:i/>
+          <w:iCs/>
+        </w:rPr>
+        <w:t xml:space="preserve">no reviewed app usage yet</w:t>
+      </w:r>
+      <w:r>
+        <w:t xml:space="preserve">, not "no PDC assets": running the policies you author here is exactly what fills PDC's real facet. See </w:t>
+      </w:r>
+      <w:r>
+        <w:rPr>
+          <w:i/>
+          <w:iCs/>
+        </w:rPr>
+        <w:t xml:space="preserve">Tags &amp; the Domain Pack → Reading the Search facet preview</w:t>
+      </w:r>
+      <w:r>
+        <w:t xml:space="preserve"> for the retire rules.</w:t>
       </w:r>
     </w:p>
     <w:p>

</xml_diff>